<commit_message>
decoder 2->4 ly thuyet + wave
</commit_message>
<xml_diff>
--- a/Doc/OnTap/1_Verilog_Module_Assign_HalfAdder.docx
+++ b/Doc/OnTap/1_Verilog_Module_Assign_HalfAdder.docx
@@ -4320,10 +4320,10 @@
       </w:tblPr>
       <w:tblGrid>
         <w:gridCol w:w="1994"/>
-        <w:gridCol w:w="1993"/>
-        <w:gridCol w:w="1996"/>
-        <w:gridCol w:w="1993"/>
-        <w:gridCol w:w="1996"/>
+        <w:gridCol w:w="1992"/>
+        <w:gridCol w:w="1997"/>
+        <w:gridCol w:w="1992"/>
+        <w:gridCol w:w="1997"/>
       </w:tblGrid>
       <w:tr>
         <w:trPr/>
@@ -4367,7 +4367,7 @@
         </w:tc>
         <w:tc>
           <w:tcPr>
-            <w:tcW w:w="1993" w:type="dxa"/>
+            <w:tcW w:w="1992" w:type="dxa"/>
             <w:tcBorders>
               <w:top w:val="single" w:sz="4" w:space="0" w:color="000000"/>
               <w:left w:val="single" w:sz="4" w:space="0" w:color="000000"/>
@@ -4405,7 +4405,7 @@
         </w:tc>
         <w:tc>
           <w:tcPr>
-            <w:tcW w:w="1996" w:type="dxa"/>
+            <w:tcW w:w="1997" w:type="dxa"/>
             <w:tcBorders>
               <w:top w:val="single" w:sz="4" w:space="0" w:color="000000"/>
               <w:left w:val="single" w:sz="4" w:space="0" w:color="000000"/>
@@ -4443,7 +4443,7 @@
         </w:tc>
         <w:tc>
           <w:tcPr>
-            <w:tcW w:w="1993" w:type="dxa"/>
+            <w:tcW w:w="1992" w:type="dxa"/>
             <w:tcBorders>
               <w:top w:val="single" w:sz="4" w:space="0" w:color="000000"/>
               <w:left w:val="single" w:sz="4" w:space="0" w:color="000000"/>
@@ -4493,7 +4493,7 @@
         </w:tc>
         <w:tc>
           <w:tcPr>
-            <w:tcW w:w="1996" w:type="dxa"/>
+            <w:tcW w:w="1997" w:type="dxa"/>
             <w:tcBorders>
               <w:top w:val="single" w:sz="4" w:space="0" w:color="000000"/>
               <w:left w:val="single" w:sz="4" w:space="0" w:color="000000"/>
@@ -4562,7 +4562,7 @@
         </w:tc>
         <w:tc>
           <w:tcPr>
-            <w:tcW w:w="1993" w:type="dxa"/>
+            <w:tcW w:w="1992" w:type="dxa"/>
             <w:tcBorders>
               <w:left w:val="single" w:sz="4" w:space="0" w:color="000000"/>
               <w:bottom w:val="single" w:sz="4" w:space="0" w:color="000000"/>
@@ -4589,7 +4589,7 @@
         </w:tc>
         <w:tc>
           <w:tcPr>
-            <w:tcW w:w="1996" w:type="dxa"/>
+            <w:tcW w:w="1997" w:type="dxa"/>
             <w:tcBorders>
               <w:left w:val="single" w:sz="4" w:space="0" w:color="000000"/>
               <w:bottom w:val="single" w:sz="4" w:space="0" w:color="000000"/>
@@ -4616,7 +4616,7 @@
         </w:tc>
         <w:tc>
           <w:tcPr>
-            <w:tcW w:w="1993" w:type="dxa"/>
+            <w:tcW w:w="1992" w:type="dxa"/>
             <w:tcBorders>
               <w:left w:val="single" w:sz="4" w:space="0" w:color="000000"/>
               <w:bottom w:val="single" w:sz="4" w:space="0" w:color="000000"/>
@@ -4643,7 +4643,7 @@
         </w:tc>
         <w:tc>
           <w:tcPr>
-            <w:tcW w:w="1996" w:type="dxa"/>
+            <w:tcW w:w="1997" w:type="dxa"/>
             <w:tcBorders>
               <w:left w:val="single" w:sz="4" w:space="0" w:color="000000"/>
               <w:bottom w:val="single" w:sz="4" w:space="0" w:color="000000"/>
@@ -4701,7 +4701,7 @@
         </w:tc>
         <w:tc>
           <w:tcPr>
-            <w:tcW w:w="1993" w:type="dxa"/>
+            <w:tcW w:w="1992" w:type="dxa"/>
             <w:tcBorders>
               <w:left w:val="single" w:sz="4" w:space="0" w:color="000000"/>
               <w:bottom w:val="single" w:sz="4" w:space="0" w:color="000000"/>
@@ -4728,7 +4728,7 @@
         </w:tc>
         <w:tc>
           <w:tcPr>
-            <w:tcW w:w="1996" w:type="dxa"/>
+            <w:tcW w:w="1997" w:type="dxa"/>
             <w:tcBorders>
               <w:left w:val="single" w:sz="4" w:space="0" w:color="000000"/>
               <w:bottom w:val="single" w:sz="4" w:space="0" w:color="000000"/>
@@ -4755,7 +4755,7 @@
         </w:tc>
         <w:tc>
           <w:tcPr>
-            <w:tcW w:w="1993" w:type="dxa"/>
+            <w:tcW w:w="1992" w:type="dxa"/>
             <w:tcBorders>
               <w:left w:val="single" w:sz="4" w:space="0" w:color="000000"/>
               <w:bottom w:val="single" w:sz="4" w:space="0" w:color="000000"/>
@@ -4782,7 +4782,7 @@
         </w:tc>
         <w:tc>
           <w:tcPr>
-            <w:tcW w:w="1996" w:type="dxa"/>
+            <w:tcW w:w="1997" w:type="dxa"/>
             <w:tcBorders>
               <w:left w:val="single" w:sz="4" w:space="0" w:color="000000"/>
               <w:bottom w:val="single" w:sz="4" w:space="0" w:color="000000"/>
@@ -4842,7 +4842,7 @@
         </w:tc>
         <w:tc>
           <w:tcPr>
-            <w:tcW w:w="1993" w:type="dxa"/>
+            <w:tcW w:w="1992" w:type="dxa"/>
             <w:tcBorders>
               <w:left w:val="single" w:sz="4" w:space="0" w:color="000000"/>
               <w:bottom w:val="single" w:sz="4" w:space="0" w:color="000000"/>
@@ -4869,7 +4869,7 @@
         </w:tc>
         <w:tc>
           <w:tcPr>
-            <w:tcW w:w="1996" w:type="dxa"/>
+            <w:tcW w:w="1997" w:type="dxa"/>
             <w:tcBorders>
               <w:left w:val="single" w:sz="4" w:space="0" w:color="000000"/>
               <w:bottom w:val="single" w:sz="4" w:space="0" w:color="000000"/>
@@ -4896,7 +4896,7 @@
         </w:tc>
         <w:tc>
           <w:tcPr>
-            <w:tcW w:w="1993" w:type="dxa"/>
+            <w:tcW w:w="1992" w:type="dxa"/>
             <w:tcBorders>
               <w:left w:val="single" w:sz="4" w:space="0" w:color="000000"/>
               <w:bottom w:val="single" w:sz="4" w:space="0" w:color="000000"/>
@@ -4923,7 +4923,7 @@
         </w:tc>
         <w:tc>
           <w:tcPr>
-            <w:tcW w:w="1996" w:type="dxa"/>
+            <w:tcW w:w="1997" w:type="dxa"/>
             <w:tcBorders>
               <w:left w:val="single" w:sz="4" w:space="0" w:color="000000"/>
               <w:bottom w:val="single" w:sz="4" w:space="0" w:color="000000"/>
@@ -4983,7 +4983,7 @@
         </w:tc>
         <w:tc>
           <w:tcPr>
-            <w:tcW w:w="1993" w:type="dxa"/>
+            <w:tcW w:w="1992" w:type="dxa"/>
             <w:tcBorders>
               <w:left w:val="single" w:sz="4" w:space="0" w:color="000000"/>
               <w:bottom w:val="single" w:sz="4" w:space="0" w:color="000000"/>
@@ -5010,7 +5010,7 @@
         </w:tc>
         <w:tc>
           <w:tcPr>
-            <w:tcW w:w="1996" w:type="dxa"/>
+            <w:tcW w:w="1997" w:type="dxa"/>
             <w:tcBorders>
               <w:left w:val="single" w:sz="4" w:space="0" w:color="000000"/>
               <w:bottom w:val="single" w:sz="4" w:space="0" w:color="000000"/>
@@ -5037,7 +5037,7 @@
         </w:tc>
         <w:tc>
           <w:tcPr>
-            <w:tcW w:w="1993" w:type="dxa"/>
+            <w:tcW w:w="1992" w:type="dxa"/>
             <w:tcBorders>
               <w:left w:val="single" w:sz="4" w:space="0" w:color="000000"/>
               <w:bottom w:val="single" w:sz="4" w:space="0" w:color="000000"/>
@@ -5064,7 +5064,7 @@
         </w:tc>
         <w:tc>
           <w:tcPr>
-            <w:tcW w:w="1996" w:type="dxa"/>
+            <w:tcW w:w="1997" w:type="dxa"/>
             <w:tcBorders>
               <w:left w:val="single" w:sz="4" w:space="0" w:color="000000"/>
               <w:bottom w:val="single" w:sz="4" w:space="0" w:color="000000"/>
@@ -5124,7 +5124,7 @@
         </w:tc>
         <w:tc>
           <w:tcPr>
-            <w:tcW w:w="1993" w:type="dxa"/>
+            <w:tcW w:w="1992" w:type="dxa"/>
             <w:tcBorders>
               <w:left w:val="single" w:sz="4" w:space="0" w:color="000000"/>
               <w:bottom w:val="single" w:sz="4" w:space="0" w:color="000000"/>
@@ -5151,7 +5151,7 @@
         </w:tc>
         <w:tc>
           <w:tcPr>
-            <w:tcW w:w="1996" w:type="dxa"/>
+            <w:tcW w:w="1997" w:type="dxa"/>
             <w:tcBorders>
               <w:left w:val="single" w:sz="4" w:space="0" w:color="000000"/>
               <w:bottom w:val="single" w:sz="4" w:space="0" w:color="000000"/>
@@ -5178,7 +5178,7 @@
         </w:tc>
         <w:tc>
           <w:tcPr>
-            <w:tcW w:w="1993" w:type="dxa"/>
+            <w:tcW w:w="1992" w:type="dxa"/>
             <w:tcBorders>
               <w:left w:val="single" w:sz="4" w:space="0" w:color="000000"/>
               <w:bottom w:val="single" w:sz="4" w:space="0" w:color="000000"/>
@@ -5205,7 +5205,7 @@
         </w:tc>
         <w:tc>
           <w:tcPr>
-            <w:tcW w:w="1996" w:type="dxa"/>
+            <w:tcW w:w="1997" w:type="dxa"/>
             <w:tcBorders>
               <w:left w:val="single" w:sz="4" w:space="0" w:color="000000"/>
               <w:bottom w:val="single" w:sz="4" w:space="0" w:color="000000"/>
@@ -5265,7 +5265,7 @@
         </w:tc>
         <w:tc>
           <w:tcPr>
-            <w:tcW w:w="1993" w:type="dxa"/>
+            <w:tcW w:w="1992" w:type="dxa"/>
             <w:tcBorders>
               <w:left w:val="single" w:sz="4" w:space="0" w:color="000000"/>
               <w:bottom w:val="single" w:sz="4" w:space="0" w:color="000000"/>
@@ -5292,7 +5292,7 @@
         </w:tc>
         <w:tc>
           <w:tcPr>
-            <w:tcW w:w="1996" w:type="dxa"/>
+            <w:tcW w:w="1997" w:type="dxa"/>
             <w:tcBorders>
               <w:left w:val="single" w:sz="4" w:space="0" w:color="000000"/>
               <w:bottom w:val="single" w:sz="4" w:space="0" w:color="000000"/>
@@ -5319,7 +5319,7 @@
         </w:tc>
         <w:tc>
           <w:tcPr>
-            <w:tcW w:w="1993" w:type="dxa"/>
+            <w:tcW w:w="1992" w:type="dxa"/>
             <w:tcBorders>
               <w:left w:val="single" w:sz="4" w:space="0" w:color="000000"/>
               <w:bottom w:val="single" w:sz="4" w:space="0" w:color="000000"/>
@@ -5346,7 +5346,7 @@
         </w:tc>
         <w:tc>
           <w:tcPr>
-            <w:tcW w:w="1996" w:type="dxa"/>
+            <w:tcW w:w="1997" w:type="dxa"/>
             <w:tcBorders>
               <w:left w:val="single" w:sz="4" w:space="0" w:color="000000"/>
               <w:bottom w:val="single" w:sz="4" w:space="0" w:color="000000"/>
@@ -5406,7 +5406,7 @@
         </w:tc>
         <w:tc>
           <w:tcPr>
-            <w:tcW w:w="1993" w:type="dxa"/>
+            <w:tcW w:w="1992" w:type="dxa"/>
             <w:tcBorders>
               <w:left w:val="single" w:sz="4" w:space="0" w:color="000000"/>
               <w:bottom w:val="single" w:sz="4" w:space="0" w:color="000000"/>
@@ -5433,7 +5433,7 @@
         </w:tc>
         <w:tc>
           <w:tcPr>
-            <w:tcW w:w="1996" w:type="dxa"/>
+            <w:tcW w:w="1997" w:type="dxa"/>
             <w:tcBorders>
               <w:left w:val="single" w:sz="4" w:space="0" w:color="000000"/>
               <w:bottom w:val="single" w:sz="4" w:space="0" w:color="000000"/>
@@ -5460,7 +5460,7 @@
         </w:tc>
         <w:tc>
           <w:tcPr>
-            <w:tcW w:w="1993" w:type="dxa"/>
+            <w:tcW w:w="1992" w:type="dxa"/>
             <w:tcBorders>
               <w:left w:val="single" w:sz="4" w:space="0" w:color="000000"/>
               <w:bottom w:val="single" w:sz="4" w:space="0" w:color="000000"/>
@@ -5487,7 +5487,7 @@
         </w:tc>
         <w:tc>
           <w:tcPr>
-            <w:tcW w:w="1996" w:type="dxa"/>
+            <w:tcW w:w="1997" w:type="dxa"/>
             <w:tcBorders>
               <w:left w:val="single" w:sz="4" w:space="0" w:color="000000"/>
               <w:bottom w:val="single" w:sz="4" w:space="0" w:color="000000"/>
@@ -5547,7 +5547,7 @@
         </w:tc>
         <w:tc>
           <w:tcPr>
-            <w:tcW w:w="1993" w:type="dxa"/>
+            <w:tcW w:w="1992" w:type="dxa"/>
             <w:tcBorders>
               <w:left w:val="single" w:sz="4" w:space="0" w:color="000000"/>
               <w:bottom w:val="single" w:sz="4" w:space="0" w:color="000000"/>
@@ -5574,7 +5574,7 @@
         </w:tc>
         <w:tc>
           <w:tcPr>
-            <w:tcW w:w="1996" w:type="dxa"/>
+            <w:tcW w:w="1997" w:type="dxa"/>
             <w:tcBorders>
               <w:left w:val="single" w:sz="4" w:space="0" w:color="000000"/>
               <w:bottom w:val="single" w:sz="4" w:space="0" w:color="000000"/>
@@ -5601,7 +5601,7 @@
         </w:tc>
         <w:tc>
           <w:tcPr>
-            <w:tcW w:w="1993" w:type="dxa"/>
+            <w:tcW w:w="1992" w:type="dxa"/>
             <w:tcBorders>
               <w:left w:val="single" w:sz="4" w:space="0" w:color="000000"/>
               <w:bottom w:val="single" w:sz="4" w:space="0" w:color="000000"/>
@@ -5628,7 +5628,7 @@
         </w:tc>
         <w:tc>
           <w:tcPr>
-            <w:tcW w:w="1996" w:type="dxa"/>
+            <w:tcW w:w="1997" w:type="dxa"/>
             <w:tcBorders>
               <w:left w:val="single" w:sz="4" w:space="0" w:color="000000"/>
               <w:bottom w:val="single" w:sz="4" w:space="0" w:color="000000"/>
@@ -6714,13 +6714,7 @@
         <w:rPr>
           <w:rStyle w:val="SourceText"/>
         </w:rPr>
-        <w:t xml:space="preserve">nghĩa là </w:t>
-      </w:r>
-      <w:r>
-        <w:rPr>
-          <w:rStyle w:val="SourceText"/>
-        </w:rPr>
-        <w:t>sel</w:t>
+        <w:t>nghĩa là sel</w:t>
       </w:r>
       <w:r>
         <w:rPr>
@@ -6753,7 +6747,7 @@
         <w:ind w:hanging="0" w:left="0" w:right="0"/>
         <w:rPr/>
       </w:pPr>
-      <w:bookmarkStart w:id="25" w:name="code-block-viewer_Copy_1"/>
+      <w:bookmarkStart w:id="25" w:name="code-block-viewer_Copy_1_Copy_1"/>
       <w:bookmarkEnd w:id="25"/>
       <w:r>
         <w:rPr>
@@ -6981,7 +6975,7 @@
         <w:ind w:hanging="0" w:left="0" w:right="0"/>
         <w:rPr/>
       </w:pPr>
-      <w:bookmarkStart w:id="26" w:name="code-block-viewer_Copy_2"/>
+      <w:bookmarkStart w:id="26" w:name="code-block-viewer_Copy_2_Copy_1"/>
       <w:bookmarkEnd w:id="26"/>
       <w:r>
         <w:rPr>
@@ -7082,7 +7076,7 @@
       </w:tblPr>
       <w:tblGrid>
         <w:gridCol w:w="841"/>
-        <w:gridCol w:w="837"/>
+        <w:gridCol w:w="836"/>
       </w:tblGrid>
       <w:tr>
         <w:trPr>
@@ -7107,7 +7101,7 @@
         </w:tc>
         <w:tc>
           <w:tcPr>
-            <w:tcW w:w="837" w:type="dxa"/>
+            <w:tcW w:w="836" w:type="dxa"/>
             <w:tcBorders/>
             <w:vAlign w:val="center"/>
           </w:tcPr>
@@ -7146,7 +7140,7 @@
         </w:tc>
         <w:tc>
           <w:tcPr>
-            <w:tcW w:w="837" w:type="dxa"/>
+            <w:tcW w:w="836" w:type="dxa"/>
             <w:tcBorders/>
             <w:vAlign w:val="center"/>
           </w:tcPr>
@@ -7185,7 +7179,7 @@
         </w:tc>
         <w:tc>
           <w:tcPr>
-            <w:tcW w:w="837" w:type="dxa"/>
+            <w:tcW w:w="836" w:type="dxa"/>
             <w:tcBorders/>
             <w:vAlign w:val="center"/>
           </w:tcPr>
@@ -7224,7 +7218,7 @@
         </w:tc>
         <w:tc>
           <w:tcPr>
-            <w:tcW w:w="837" w:type="dxa"/>
+            <w:tcW w:w="836" w:type="dxa"/>
             <w:tcBorders/>
             <w:vAlign w:val="center"/>
           </w:tcPr>
@@ -7263,7 +7257,7 @@
         </w:tc>
         <w:tc>
           <w:tcPr>
-            <w:tcW w:w="837" w:type="dxa"/>
+            <w:tcW w:w="836" w:type="dxa"/>
             <w:tcBorders/>
             <w:vAlign w:val="center"/>
           </w:tcPr>
@@ -7289,6 +7283,42 @@
       </w:pPr>
       <w:r>
         <w:rPr/>
+      </w:r>
+    </w:p>
+    <w:p>
+      <w:pPr>
+        <w:pStyle w:val="BodyText"/>
+        <w:rPr>
+          <w:rStyle w:val="SourceText"/>
+        </w:rPr>
+      </w:pPr>
+      <w:r>
+        <w:rPr/>
+        <w:t>ex1:</w:t>
+      </w:r>
+    </w:p>
+    <w:p>
+      <w:pPr>
+        <w:pStyle w:val="BodyText"/>
+        <w:rPr>
+          <w:rStyle w:val="SourceText"/>
+        </w:rPr>
+      </w:pPr>
+      <w:r>
+        <w:rPr/>
+        <w:t>tương tự 4’b0010</w:t>
+      </w:r>
+    </w:p>
+    <w:p>
+      <w:pPr>
+        <w:pStyle w:val="BodyText"/>
+        <w:rPr>
+          <w:rStyle w:val="SourceText"/>
+        </w:rPr>
+      </w:pPr>
+      <w:r>
+        <w:rPr/>
+        <w:t>là 4 bit , b=binary, giá trị 0010</w:t>
       </w:r>
     </w:p>
     <w:p>
@@ -7313,7 +7343,7 @@
         <w:pStyle w:val="PreformattedText"/>
         <w:rPr/>
       </w:pPr>
-      <w:bookmarkStart w:id="27" w:name="code-block-viewer_Copy_3"/>
+      <w:bookmarkStart w:id="27" w:name="code-block-viewer_Copy_3_Copy_1"/>
       <w:bookmarkEnd w:id="27"/>
       <w:r>
         <w:rPr>
@@ -7430,7 +7460,7 @@
         <w:ind w:hanging="0" w:left="0" w:right="0"/>
         <w:rPr/>
       </w:pPr>
-      <w:bookmarkStart w:id="28" w:name="code-block-viewer_Copy_4"/>
+      <w:bookmarkStart w:id="28" w:name="code-block-viewer_Copy_4_Copy_1"/>
       <w:bookmarkEnd w:id="28"/>
       <w:r>
         <w:rPr>
@@ -7480,7 +7510,7 @@
         <w:ind w:hanging="0" w:left="0" w:right="0"/>
         <w:rPr/>
       </w:pPr>
-      <w:bookmarkStart w:id="29" w:name="code-block-viewer_Copy_5"/>
+      <w:bookmarkStart w:id="29" w:name="code-block-viewer_Copy_5_Copy_1"/>
       <w:bookmarkEnd w:id="29"/>
       <w:r>
         <w:rPr>

</xml_diff>

<commit_message>
comparator_2bit with generate-option and call-another-module option
</commit_message>
<xml_diff>
--- a/Doc/OnTap/1_Verilog_Module_Assign_HalfAdder.docx
+++ b/Doc/OnTap/1_Verilog_Module_Assign_HalfAdder.docx
@@ -4320,10 +4320,10 @@
       </w:tblPr>
       <w:tblGrid>
         <w:gridCol w:w="1994"/>
-        <w:gridCol w:w="1992"/>
-        <w:gridCol w:w="1997"/>
-        <w:gridCol w:w="1992"/>
-        <w:gridCol w:w="1997"/>
+        <w:gridCol w:w="1991"/>
+        <w:gridCol w:w="1998"/>
+        <w:gridCol w:w="1991"/>
+        <w:gridCol w:w="1998"/>
       </w:tblGrid>
       <w:tr>
         <w:trPr/>
@@ -4367,7 +4367,7 @@
         </w:tc>
         <w:tc>
           <w:tcPr>
-            <w:tcW w:w="1992" w:type="dxa"/>
+            <w:tcW w:w="1991" w:type="dxa"/>
             <w:tcBorders>
               <w:top w:val="single" w:sz="4" w:space="0" w:color="000000"/>
               <w:left w:val="single" w:sz="4" w:space="0" w:color="000000"/>
@@ -4405,7 +4405,7 @@
         </w:tc>
         <w:tc>
           <w:tcPr>
-            <w:tcW w:w="1997" w:type="dxa"/>
+            <w:tcW w:w="1998" w:type="dxa"/>
             <w:tcBorders>
               <w:top w:val="single" w:sz="4" w:space="0" w:color="000000"/>
               <w:left w:val="single" w:sz="4" w:space="0" w:color="000000"/>
@@ -4443,7 +4443,7 @@
         </w:tc>
         <w:tc>
           <w:tcPr>
-            <w:tcW w:w="1992" w:type="dxa"/>
+            <w:tcW w:w="1991" w:type="dxa"/>
             <w:tcBorders>
               <w:top w:val="single" w:sz="4" w:space="0" w:color="000000"/>
               <w:left w:val="single" w:sz="4" w:space="0" w:color="000000"/>
@@ -4493,7 +4493,7 @@
         </w:tc>
         <w:tc>
           <w:tcPr>
-            <w:tcW w:w="1997" w:type="dxa"/>
+            <w:tcW w:w="1998" w:type="dxa"/>
             <w:tcBorders>
               <w:top w:val="single" w:sz="4" w:space="0" w:color="000000"/>
               <w:left w:val="single" w:sz="4" w:space="0" w:color="000000"/>
@@ -4562,7 +4562,7 @@
         </w:tc>
         <w:tc>
           <w:tcPr>
-            <w:tcW w:w="1992" w:type="dxa"/>
+            <w:tcW w:w="1991" w:type="dxa"/>
             <w:tcBorders>
               <w:left w:val="single" w:sz="4" w:space="0" w:color="000000"/>
               <w:bottom w:val="single" w:sz="4" w:space="0" w:color="000000"/>
@@ -4589,7 +4589,7 @@
         </w:tc>
         <w:tc>
           <w:tcPr>
-            <w:tcW w:w="1997" w:type="dxa"/>
+            <w:tcW w:w="1998" w:type="dxa"/>
             <w:tcBorders>
               <w:left w:val="single" w:sz="4" w:space="0" w:color="000000"/>
               <w:bottom w:val="single" w:sz="4" w:space="0" w:color="000000"/>
@@ -4616,7 +4616,7 @@
         </w:tc>
         <w:tc>
           <w:tcPr>
-            <w:tcW w:w="1992" w:type="dxa"/>
+            <w:tcW w:w="1991" w:type="dxa"/>
             <w:tcBorders>
               <w:left w:val="single" w:sz="4" w:space="0" w:color="000000"/>
               <w:bottom w:val="single" w:sz="4" w:space="0" w:color="000000"/>
@@ -4643,7 +4643,7 @@
         </w:tc>
         <w:tc>
           <w:tcPr>
-            <w:tcW w:w="1997" w:type="dxa"/>
+            <w:tcW w:w="1998" w:type="dxa"/>
             <w:tcBorders>
               <w:left w:val="single" w:sz="4" w:space="0" w:color="000000"/>
               <w:bottom w:val="single" w:sz="4" w:space="0" w:color="000000"/>
@@ -4701,7 +4701,7 @@
         </w:tc>
         <w:tc>
           <w:tcPr>
-            <w:tcW w:w="1992" w:type="dxa"/>
+            <w:tcW w:w="1991" w:type="dxa"/>
             <w:tcBorders>
               <w:left w:val="single" w:sz="4" w:space="0" w:color="000000"/>
               <w:bottom w:val="single" w:sz="4" w:space="0" w:color="000000"/>
@@ -4728,7 +4728,7 @@
         </w:tc>
         <w:tc>
           <w:tcPr>
-            <w:tcW w:w="1997" w:type="dxa"/>
+            <w:tcW w:w="1998" w:type="dxa"/>
             <w:tcBorders>
               <w:left w:val="single" w:sz="4" w:space="0" w:color="000000"/>
               <w:bottom w:val="single" w:sz="4" w:space="0" w:color="000000"/>
@@ -4755,7 +4755,7 @@
         </w:tc>
         <w:tc>
           <w:tcPr>
-            <w:tcW w:w="1992" w:type="dxa"/>
+            <w:tcW w:w="1991" w:type="dxa"/>
             <w:tcBorders>
               <w:left w:val="single" w:sz="4" w:space="0" w:color="000000"/>
               <w:bottom w:val="single" w:sz="4" w:space="0" w:color="000000"/>
@@ -4782,7 +4782,7 @@
         </w:tc>
         <w:tc>
           <w:tcPr>
-            <w:tcW w:w="1997" w:type="dxa"/>
+            <w:tcW w:w="1998" w:type="dxa"/>
             <w:tcBorders>
               <w:left w:val="single" w:sz="4" w:space="0" w:color="000000"/>
               <w:bottom w:val="single" w:sz="4" w:space="0" w:color="000000"/>
@@ -4842,7 +4842,7 @@
         </w:tc>
         <w:tc>
           <w:tcPr>
-            <w:tcW w:w="1992" w:type="dxa"/>
+            <w:tcW w:w="1991" w:type="dxa"/>
             <w:tcBorders>
               <w:left w:val="single" w:sz="4" w:space="0" w:color="000000"/>
               <w:bottom w:val="single" w:sz="4" w:space="0" w:color="000000"/>
@@ -4869,7 +4869,7 @@
         </w:tc>
         <w:tc>
           <w:tcPr>
-            <w:tcW w:w="1997" w:type="dxa"/>
+            <w:tcW w:w="1998" w:type="dxa"/>
             <w:tcBorders>
               <w:left w:val="single" w:sz="4" w:space="0" w:color="000000"/>
               <w:bottom w:val="single" w:sz="4" w:space="0" w:color="000000"/>
@@ -4896,7 +4896,7 @@
         </w:tc>
         <w:tc>
           <w:tcPr>
-            <w:tcW w:w="1992" w:type="dxa"/>
+            <w:tcW w:w="1991" w:type="dxa"/>
             <w:tcBorders>
               <w:left w:val="single" w:sz="4" w:space="0" w:color="000000"/>
               <w:bottom w:val="single" w:sz="4" w:space="0" w:color="000000"/>
@@ -4923,7 +4923,7 @@
         </w:tc>
         <w:tc>
           <w:tcPr>
-            <w:tcW w:w="1997" w:type="dxa"/>
+            <w:tcW w:w="1998" w:type="dxa"/>
             <w:tcBorders>
               <w:left w:val="single" w:sz="4" w:space="0" w:color="000000"/>
               <w:bottom w:val="single" w:sz="4" w:space="0" w:color="000000"/>
@@ -4983,7 +4983,7 @@
         </w:tc>
         <w:tc>
           <w:tcPr>
-            <w:tcW w:w="1992" w:type="dxa"/>
+            <w:tcW w:w="1991" w:type="dxa"/>
             <w:tcBorders>
               <w:left w:val="single" w:sz="4" w:space="0" w:color="000000"/>
               <w:bottom w:val="single" w:sz="4" w:space="0" w:color="000000"/>
@@ -5010,7 +5010,7 @@
         </w:tc>
         <w:tc>
           <w:tcPr>
-            <w:tcW w:w="1997" w:type="dxa"/>
+            <w:tcW w:w="1998" w:type="dxa"/>
             <w:tcBorders>
               <w:left w:val="single" w:sz="4" w:space="0" w:color="000000"/>
               <w:bottom w:val="single" w:sz="4" w:space="0" w:color="000000"/>
@@ -5037,7 +5037,7 @@
         </w:tc>
         <w:tc>
           <w:tcPr>
-            <w:tcW w:w="1992" w:type="dxa"/>
+            <w:tcW w:w="1991" w:type="dxa"/>
             <w:tcBorders>
               <w:left w:val="single" w:sz="4" w:space="0" w:color="000000"/>
               <w:bottom w:val="single" w:sz="4" w:space="0" w:color="000000"/>
@@ -5064,7 +5064,7 @@
         </w:tc>
         <w:tc>
           <w:tcPr>
-            <w:tcW w:w="1997" w:type="dxa"/>
+            <w:tcW w:w="1998" w:type="dxa"/>
             <w:tcBorders>
               <w:left w:val="single" w:sz="4" w:space="0" w:color="000000"/>
               <w:bottom w:val="single" w:sz="4" w:space="0" w:color="000000"/>
@@ -5124,7 +5124,7 @@
         </w:tc>
         <w:tc>
           <w:tcPr>
-            <w:tcW w:w="1992" w:type="dxa"/>
+            <w:tcW w:w="1991" w:type="dxa"/>
             <w:tcBorders>
               <w:left w:val="single" w:sz="4" w:space="0" w:color="000000"/>
               <w:bottom w:val="single" w:sz="4" w:space="0" w:color="000000"/>
@@ -5151,7 +5151,7 @@
         </w:tc>
         <w:tc>
           <w:tcPr>
-            <w:tcW w:w="1997" w:type="dxa"/>
+            <w:tcW w:w="1998" w:type="dxa"/>
             <w:tcBorders>
               <w:left w:val="single" w:sz="4" w:space="0" w:color="000000"/>
               <w:bottom w:val="single" w:sz="4" w:space="0" w:color="000000"/>
@@ -5178,7 +5178,7 @@
         </w:tc>
         <w:tc>
           <w:tcPr>
-            <w:tcW w:w="1992" w:type="dxa"/>
+            <w:tcW w:w="1991" w:type="dxa"/>
             <w:tcBorders>
               <w:left w:val="single" w:sz="4" w:space="0" w:color="000000"/>
               <w:bottom w:val="single" w:sz="4" w:space="0" w:color="000000"/>
@@ -5205,7 +5205,7 @@
         </w:tc>
         <w:tc>
           <w:tcPr>
-            <w:tcW w:w="1997" w:type="dxa"/>
+            <w:tcW w:w="1998" w:type="dxa"/>
             <w:tcBorders>
               <w:left w:val="single" w:sz="4" w:space="0" w:color="000000"/>
               <w:bottom w:val="single" w:sz="4" w:space="0" w:color="000000"/>
@@ -5265,7 +5265,7 @@
         </w:tc>
         <w:tc>
           <w:tcPr>
-            <w:tcW w:w="1992" w:type="dxa"/>
+            <w:tcW w:w="1991" w:type="dxa"/>
             <w:tcBorders>
               <w:left w:val="single" w:sz="4" w:space="0" w:color="000000"/>
               <w:bottom w:val="single" w:sz="4" w:space="0" w:color="000000"/>
@@ -5292,7 +5292,7 @@
         </w:tc>
         <w:tc>
           <w:tcPr>
-            <w:tcW w:w="1997" w:type="dxa"/>
+            <w:tcW w:w="1998" w:type="dxa"/>
             <w:tcBorders>
               <w:left w:val="single" w:sz="4" w:space="0" w:color="000000"/>
               <w:bottom w:val="single" w:sz="4" w:space="0" w:color="000000"/>
@@ -5319,7 +5319,7 @@
         </w:tc>
         <w:tc>
           <w:tcPr>
-            <w:tcW w:w="1992" w:type="dxa"/>
+            <w:tcW w:w="1991" w:type="dxa"/>
             <w:tcBorders>
               <w:left w:val="single" w:sz="4" w:space="0" w:color="000000"/>
               <w:bottom w:val="single" w:sz="4" w:space="0" w:color="000000"/>
@@ -5346,7 +5346,7 @@
         </w:tc>
         <w:tc>
           <w:tcPr>
-            <w:tcW w:w="1997" w:type="dxa"/>
+            <w:tcW w:w="1998" w:type="dxa"/>
             <w:tcBorders>
               <w:left w:val="single" w:sz="4" w:space="0" w:color="000000"/>
               <w:bottom w:val="single" w:sz="4" w:space="0" w:color="000000"/>
@@ -5406,7 +5406,7 @@
         </w:tc>
         <w:tc>
           <w:tcPr>
-            <w:tcW w:w="1992" w:type="dxa"/>
+            <w:tcW w:w="1991" w:type="dxa"/>
             <w:tcBorders>
               <w:left w:val="single" w:sz="4" w:space="0" w:color="000000"/>
               <w:bottom w:val="single" w:sz="4" w:space="0" w:color="000000"/>
@@ -5433,7 +5433,7 @@
         </w:tc>
         <w:tc>
           <w:tcPr>
-            <w:tcW w:w="1997" w:type="dxa"/>
+            <w:tcW w:w="1998" w:type="dxa"/>
             <w:tcBorders>
               <w:left w:val="single" w:sz="4" w:space="0" w:color="000000"/>
               <w:bottom w:val="single" w:sz="4" w:space="0" w:color="000000"/>
@@ -5460,7 +5460,7 @@
         </w:tc>
         <w:tc>
           <w:tcPr>
-            <w:tcW w:w="1992" w:type="dxa"/>
+            <w:tcW w:w="1991" w:type="dxa"/>
             <w:tcBorders>
               <w:left w:val="single" w:sz="4" w:space="0" w:color="000000"/>
               <w:bottom w:val="single" w:sz="4" w:space="0" w:color="000000"/>
@@ -5487,7 +5487,7 @@
         </w:tc>
         <w:tc>
           <w:tcPr>
-            <w:tcW w:w="1997" w:type="dxa"/>
+            <w:tcW w:w="1998" w:type="dxa"/>
             <w:tcBorders>
               <w:left w:val="single" w:sz="4" w:space="0" w:color="000000"/>
               <w:bottom w:val="single" w:sz="4" w:space="0" w:color="000000"/>
@@ -5547,7 +5547,7 @@
         </w:tc>
         <w:tc>
           <w:tcPr>
-            <w:tcW w:w="1992" w:type="dxa"/>
+            <w:tcW w:w="1991" w:type="dxa"/>
             <w:tcBorders>
               <w:left w:val="single" w:sz="4" w:space="0" w:color="000000"/>
               <w:bottom w:val="single" w:sz="4" w:space="0" w:color="000000"/>
@@ -5574,7 +5574,7 @@
         </w:tc>
         <w:tc>
           <w:tcPr>
-            <w:tcW w:w="1997" w:type="dxa"/>
+            <w:tcW w:w="1998" w:type="dxa"/>
             <w:tcBorders>
               <w:left w:val="single" w:sz="4" w:space="0" w:color="000000"/>
               <w:bottom w:val="single" w:sz="4" w:space="0" w:color="000000"/>
@@ -5601,7 +5601,7 @@
         </w:tc>
         <w:tc>
           <w:tcPr>
-            <w:tcW w:w="1992" w:type="dxa"/>
+            <w:tcW w:w="1991" w:type="dxa"/>
             <w:tcBorders>
               <w:left w:val="single" w:sz="4" w:space="0" w:color="000000"/>
               <w:bottom w:val="single" w:sz="4" w:space="0" w:color="000000"/>
@@ -5628,7 +5628,7 @@
         </w:tc>
         <w:tc>
           <w:tcPr>
-            <w:tcW w:w="1997" w:type="dxa"/>
+            <w:tcW w:w="1998" w:type="dxa"/>
             <w:tcBorders>
               <w:left w:val="single" w:sz="4" w:space="0" w:color="000000"/>
               <w:bottom w:val="single" w:sz="4" w:space="0" w:color="000000"/>
@@ -7533,13 +7533,301 @@
     </w:p>
     <w:p>
       <w:pPr>
+        <w:pStyle w:val="Heading1"/>
+        <w:numPr>
+          <w:ilvl w:val="0"/>
+          <w:numId w:val="1"/>
+        </w:numPr>
+        <w:ind w:hanging="0" w:left="0"/>
+        <w:rPr/>
+      </w:pPr>
+      <w:r>
+        <w:rPr>
+          <w:rStyle w:val="SourceText"/>
+        </w:rPr>
+        <w:t>&amp;equal_bit là gì?</w:t>
+      </w:r>
+    </w:p>
+    <w:p>
+      <w:pPr>
         <w:pStyle w:val="BodyText"/>
-        <w:rPr>
-          <w:rStyle w:val="SourceText"/>
-        </w:rPr>
-      </w:pPr>
-      <w:r>
-        <w:rPr/>
+        <w:rPr/>
+      </w:pPr>
+      <w:r>
+        <w:rPr>
+          <w:rStyle w:val="SourceText"/>
+        </w:rPr>
+        <w:t xml:space="preserve">Đây là </w:t>
+      </w:r>
+      <w:r>
+        <w:rPr>
+          <w:rStyle w:val="Strong"/>
+        </w:rPr>
+        <w:t>reduction AND</w:t>
+      </w:r>
+      <w:r>
+        <w:rPr>
+          <w:rStyle w:val="SourceText"/>
+        </w:rPr>
+        <w:t>.</w:t>
+      </w:r>
+    </w:p>
+    <w:p>
+      <w:pPr>
+        <w:pStyle w:val="BodyText"/>
+        <w:rPr/>
+      </w:pPr>
+      <w:r>
+        <w:rPr/>
+        <w:t>Nó tương đương với:</w:t>
+      </w:r>
+    </w:p>
+    <w:p>
+      <w:pPr>
+        <w:sectPr>
+          <w:type w:val="continuous"/>
+          <w:pgSz w:w="12240" w:h="15840"/>
+          <w:pgMar w:left="1134" w:right="1134" w:gutter="0" w:header="0" w:top="1134" w:footer="0" w:bottom="1134"/>
+          <w:formProt w:val="false"/>
+          <w:textDirection w:val="lrTb"/>
+          <w:docGrid w:type="default" w:linePitch="100" w:charSpace="0"/>
+        </w:sectPr>
+      </w:pPr>
+    </w:p>
+    <w:p>
+      <w:pPr>
+        <w:pStyle w:val="PreformattedText"/>
+        <w:ind w:hanging="0" w:left="0" w:right="0"/>
+        <w:rPr/>
+      </w:pPr>
+      <w:r>
+        <w:rPr>
+          <w:rStyle w:val="SourceText"/>
+        </w:rPr>
+        <w:t>assign equal =</w:t>
+      </w:r>
+    </w:p>
+    <w:p>
+      <w:pPr>
+        <w:pStyle w:val="PreformattedText"/>
+        <w:rPr/>
+      </w:pPr>
+      <w:r>
+        <w:rPr>
+          <w:rStyle w:val="SourceText"/>
+        </w:rPr>
+        <w:t xml:space="preserve">    </w:t>
+      </w:r>
+      <w:r>
+        <w:rPr>
+          <w:rStyle w:val="SourceText"/>
+        </w:rPr>
+        <w:t>equal_bit[0] &amp;</w:t>
+      </w:r>
+    </w:p>
+    <w:p>
+      <w:pPr>
+        <w:pStyle w:val="PreformattedText"/>
+        <w:rPr/>
+      </w:pPr>
+      <w:r>
+        <w:rPr>
+          <w:rStyle w:val="SourceText"/>
+        </w:rPr>
+        <w:t xml:space="preserve">    </w:t>
+      </w:r>
+      <w:r>
+        <w:rPr>
+          <w:rStyle w:val="SourceText"/>
+        </w:rPr>
+        <w:t>equal_bit[1] &amp;</w:t>
+      </w:r>
+    </w:p>
+    <w:p>
+      <w:pPr>
+        <w:pStyle w:val="PreformattedText"/>
+        <w:rPr/>
+      </w:pPr>
+      <w:r>
+        <w:rPr>
+          <w:rStyle w:val="SourceText"/>
+        </w:rPr>
+        <w:t xml:space="preserve">    </w:t>
+      </w:r>
+      <w:r>
+        <w:rPr>
+          <w:rStyle w:val="SourceText"/>
+        </w:rPr>
+        <w:t>equal_bit[2] &amp;</w:t>
+      </w:r>
+    </w:p>
+    <w:p>
+      <w:pPr>
+        <w:pStyle w:val="PreformattedText"/>
+        <w:rPr/>
+      </w:pPr>
+      <w:r>
+        <w:rPr>
+          <w:rStyle w:val="SourceText"/>
+        </w:rPr>
+        <w:t xml:space="preserve">    </w:t>
+      </w:r>
+      <w:r>
+        <w:rPr>
+          <w:rStyle w:val="SourceText"/>
+        </w:rPr>
+        <w:t>...</w:t>
+      </w:r>
+    </w:p>
+    <w:p>
+      <w:pPr>
+        <w:pStyle w:val="PreformattedText"/>
+        <w:spacing w:before="0" w:after="283"/>
+        <w:rPr/>
+      </w:pPr>
+      <w:r>
+        <w:rPr>
+          <w:rStyle w:val="SourceText"/>
+        </w:rPr>
+        <w:t xml:space="preserve">    </w:t>
+      </w:r>
+      <w:r>
+        <w:rPr>
+          <w:rStyle w:val="SourceText"/>
+        </w:rPr>
+        <w:t>equal_bit[31];</w:t>
+      </w:r>
+    </w:p>
+    <w:p>
+      <w:pPr>
+        <w:sectPr>
+          <w:type w:val="continuous"/>
+          <w:pgSz w:w="12240" w:h="15840"/>
+          <w:pgMar w:left="1134" w:right="1134" w:gutter="0" w:header="0" w:top="1134" w:footer="0" w:bottom="1134"/>
+          <w:formProt w:val="false"/>
+          <w:textDirection w:val="lrTb"/>
+          <w:docGrid w:type="default" w:linePitch="100" w:charSpace="0"/>
+        </w:sectPr>
+      </w:pPr>
+    </w:p>
+    <w:p>
+      <w:pPr>
+        <w:pStyle w:val="BodyText"/>
+        <w:rPr/>
+      </w:pPr>
+      <w:r>
+        <w:rPr/>
+        <w:t xml:space="preserve">Nên nếu </w:t>
+      </w:r>
+      <w:r>
+        <w:rPr>
+          <w:rStyle w:val="Strong"/>
+        </w:rPr>
+        <w:t>chỉ cần một bit khác nhau</w:t>
+      </w:r>
+      <w:r>
+        <w:rPr/>
+        <w:t xml:space="preserve"> thì:</w:t>
+      </w:r>
+    </w:p>
+    <w:p>
+      <w:pPr>
+        <w:sectPr>
+          <w:type w:val="continuous"/>
+          <w:pgSz w:w="12240" w:h="15840"/>
+          <w:pgMar w:left="1134" w:right="1134" w:gutter="0" w:header="0" w:top="1134" w:footer="0" w:bottom="1134"/>
+          <w:formProt w:val="false"/>
+          <w:textDirection w:val="lrTb"/>
+          <w:docGrid w:type="default" w:linePitch="100" w:charSpace="0"/>
+        </w:sectPr>
+      </w:pPr>
+    </w:p>
+    <w:p>
+      <w:pPr>
+        <w:pStyle w:val="PreformattedText"/>
+        <w:spacing w:before="0" w:after="283"/>
+        <w:ind w:hanging="0" w:left="0" w:right="0"/>
+        <w:rPr/>
+      </w:pPr>
+      <w:bookmarkStart w:id="30" w:name="code-block-viewer_Copy_1"/>
+      <w:bookmarkEnd w:id="30"/>
+      <w:r>
+        <w:rPr>
+          <w:rStyle w:val="SourceText"/>
+        </w:rPr>
+        <w:t>equal_bit = 11111110111111111111111111111111</w:t>
+      </w:r>
+    </w:p>
+    <w:p>
+      <w:pPr>
+        <w:sectPr>
+          <w:type w:val="continuous"/>
+          <w:pgSz w:w="12240" w:h="15840"/>
+          <w:pgMar w:left="1134" w:right="1134" w:gutter="0" w:header="0" w:top="1134" w:footer="0" w:bottom="1134"/>
+          <w:formProt w:val="false"/>
+          <w:textDirection w:val="lrTb"/>
+          <w:docGrid w:type="default" w:linePitch="100" w:charSpace="0"/>
+        </w:sectPr>
+      </w:pPr>
+    </w:p>
+    <w:p>
+      <w:pPr>
+        <w:pStyle w:val="BodyText"/>
+        <w:rPr/>
+      </w:pPr>
+      <w:r>
+        <w:rPr/>
+        <w:t>↓</w:t>
+      </w:r>
+    </w:p>
+    <w:p>
+      <w:pPr>
+        <w:sectPr>
+          <w:type w:val="continuous"/>
+          <w:pgSz w:w="12240" w:h="15840"/>
+          <w:pgMar w:left="1134" w:right="1134" w:gutter="0" w:header="0" w:top="1134" w:footer="0" w:bottom="1134"/>
+          <w:formProt w:val="false"/>
+          <w:textDirection w:val="lrTb"/>
+          <w:docGrid w:type="default" w:linePitch="100" w:charSpace="0"/>
+        </w:sectPr>
+      </w:pPr>
+    </w:p>
+    <w:p>
+      <w:pPr>
+        <w:pStyle w:val="PreformattedText"/>
+        <w:spacing w:before="0" w:after="283"/>
+        <w:ind w:hanging="0" w:left="0" w:right="0"/>
+        <w:rPr/>
+      </w:pPr>
+      <w:bookmarkStart w:id="31" w:name="code-block-viewer_Copy_2"/>
+      <w:bookmarkEnd w:id="31"/>
+      <w:r>
+        <w:rPr>
+          <w:rStyle w:val="SourceText"/>
+        </w:rPr>
+        <w:t>equal = 0</w:t>
+      </w:r>
+    </w:p>
+    <w:p>
+      <w:pPr>
+        <w:sectPr>
+          <w:type w:val="continuous"/>
+          <w:pgSz w:w="12240" w:h="15840"/>
+          <w:pgMar w:left="1134" w:right="1134" w:gutter="0" w:header="0" w:top="1134" w:footer="0" w:bottom="1134"/>
+          <w:formProt w:val="false"/>
+          <w:textDirection w:val="lrTb"/>
+          <w:docGrid w:type="default" w:linePitch="100" w:charSpace="0"/>
+        </w:sectPr>
+      </w:pPr>
+    </w:p>
+    <w:p>
+      <w:pPr>
+        <w:pStyle w:val="BodyText"/>
+        <w:rPr/>
+      </w:pPr>
+      <w:r>
+        <w:rPr/>
+        <w:t>Ta sẽ thấy dùng trong [generate] với compatitor_32 khi mà code quá dài để viết~~</w:t>
       </w:r>
     </w:p>
     <w:p>

</xml_diff>